<commit_message>
Update guide name and class on CEP submission files
Co-Authored-By: Claude Opus 5.5 <noreply@anthropic.com>
Claude-Session: https://claude.ai/code/session_015D4bQVZNhTGUwEsTWPJArD
</commit_message>
<xml_diff>
--- a/submission/CEP_Project_Report_AwaazSetu.docx
+++ b/submission/CEP_Project_Report_AwaazSetu.docx
@@ -516,7 +516,7 @@
           <w:sz w:val="32"/>
           <w:szCs w:val="32"/>
         </w:rPr>
-        <w:t xml:space="preserve">Prof. Priya Nerkar</w:t>
+        <w:t xml:space="preserve">Dr. Priya Nerkar</w:t>
       </w:r>
     </w:p>
     <w:p>
@@ -1168,7 +1168,7 @@
         <w:rPr>
           <w:rFonts w:cs="Calibri"/>
         </w:rPr>
-        <w:t xml:space="preserve">is a bonafide work carried out by them under the supervision of Prof. Priya Nerkar for completion of Community Engagement Project.</w:t>
+        <w:t xml:space="preserve">is a bonafide work carried out by them under the supervision of Dr. Priya Nerkar for completion of Community Engagement Project.</w:t>
       </w:r>
     </w:p>
     <w:p>
@@ -1265,7 +1265,7 @@
                 <w:rFonts w:cs="Calibri"/>
                 <w:bCs/>
               </w:rPr>
-              <w:t xml:space="preserve">Prof. Priya Nerkar</w:t>
+              <w:t xml:space="preserve">Dr. Priya Nerkar</w:t>
             </w:r>
           </w:p>
         </w:tc>

</xml_diff>

<commit_message>
Report: add HOD name and centre student tables
Co-Authored-By: Claude Opus 5.5 <noreply@anthropic.com>
Claude-Session: https://claude.ai/code/session_015D4bQVZNhTGUwEsTWPJArD
</commit_message>
<xml_diff>
--- a/submission/CEP_Project_Report_AwaazSetu.docx
+++ b/submission/CEP_Project_Report_AwaazSetu.docx
@@ -209,8 +209,8 @@
     </w:p>
     <w:tbl>
       <w:tblPr>
-        <w:tblW w:w="9270" w:type="dxa"/>
-        <w:tblInd w:w="185" w:type="dxa"/>
+        <w:tblW w:w="5400" w:type="dxa"/>
+        <w:jc w:val="center"/>
         <w:tblCellMar>
           <w:left w:w="0" w:type="dxa"/>
           <w:right w:w="0" w:type="dxa"/>
@@ -218,9 +218,9 @@
         <w:tblLook w:val="04A0" w:firstRow="1" w:lastRow="0" w:firstColumn="1" w:lastColumn="0" w:noHBand="0" w:noVBand="1"/>
       </w:tblPr>
       <w:tblGrid>
-        <w:gridCol w:w="2355"/>
-        <w:gridCol w:w="819"/>
-        <w:gridCol w:w="6096"/>
+        <w:gridCol w:w="2700"/>
+        <w:gridCol w:w="120"/>
+        <w:gridCol w:w="2580"/>
       </w:tblGrid>
       <w:tr>
         <w:trPr>
@@ -228,7 +228,7 @@
         </w:trPr>
         <w:tc>
           <w:tcPr>
-            <w:tcW w:w="2355" w:type="dxa"/>
+            <w:tcW w:w="2700" w:type="dxa"/>
             <w:shd w:val="clear" w:color="auto" w:fill="auto"/>
             <w:vAlign w:val="bottom"/>
           </w:tcPr>
@@ -246,15 +246,13 @@
         </w:tc>
         <w:tc>
           <w:tcPr>
-            <w:tcW w:w="819" w:type="dxa"/>
-            <w:shd w:val="clear" w:color="auto" w:fill="auto"/>
-            <w:vAlign w:val="bottom"/>
-          </w:tcPr>
-          <w:p>
-            <w:pPr>
-              <w:widowControl w:val="0"/>
-              <w:ind w:right="290"/>
-              <w:jc w:val="right"/>
+            <w:tcW w:w="120" w:type="dxa"/>
+            <w:shd w:val="clear" w:color="auto" w:fill="auto"/>
+            <w:vAlign w:val="bottom"/>
+          </w:tcPr>
+          <w:p>
+            <w:pPr>
+              <w:widowControl w:val="0"/>
             </w:pPr>
             <w:r>
               <w:rPr>
@@ -266,7 +264,7 @@
         </w:tc>
         <w:tc>
           <w:tcPr>
-            <w:tcW w:w="6096" w:type="dxa"/>
+            <w:tcW w:w="2580" w:type="dxa"/>
             <w:shd w:val="clear" w:color="auto" w:fill="auto"/>
             <w:vAlign w:val="bottom"/>
           </w:tcPr>
@@ -289,7 +287,7 @@
         </w:trPr>
         <w:tc>
           <w:tcPr>
-            <w:tcW w:w="2355" w:type="dxa"/>
+            <w:tcW w:w="2700" w:type="dxa"/>
             <w:shd w:val="clear" w:color="auto" w:fill="auto"/>
             <w:vAlign w:val="bottom"/>
           </w:tcPr>
@@ -307,15 +305,13 @@
         </w:tc>
         <w:tc>
           <w:tcPr>
-            <w:tcW w:w="819" w:type="dxa"/>
-            <w:shd w:val="clear" w:color="auto" w:fill="auto"/>
-            <w:vAlign w:val="bottom"/>
-          </w:tcPr>
-          <w:p>
-            <w:pPr>
-              <w:widowControl w:val="0"/>
-              <w:ind w:right="290"/>
-              <w:jc w:val="right"/>
+            <w:tcW w:w="120" w:type="dxa"/>
+            <w:shd w:val="clear" w:color="auto" w:fill="auto"/>
+            <w:vAlign w:val="bottom"/>
+          </w:tcPr>
+          <w:p>
+            <w:pPr>
+              <w:widowControl w:val="0"/>
             </w:pPr>
             <w:r>
               <w:rPr>
@@ -327,7 +323,7 @@
         </w:tc>
         <w:tc>
           <w:tcPr>
-            <w:tcW w:w="6096" w:type="dxa"/>
+            <w:tcW w:w="2580" w:type="dxa"/>
             <w:shd w:val="clear" w:color="auto" w:fill="auto"/>
             <w:vAlign w:val="bottom"/>
           </w:tcPr>
@@ -350,7 +346,7 @@
         </w:trPr>
         <w:tc>
           <w:tcPr>
-            <w:tcW w:w="2355" w:type="dxa"/>
+            <w:tcW w:w="2700" w:type="dxa"/>
             <w:shd w:val="clear" w:color="auto" w:fill="auto"/>
             <w:vAlign w:val="bottom"/>
           </w:tcPr>
@@ -368,15 +364,13 @@
         </w:tc>
         <w:tc>
           <w:tcPr>
-            <w:tcW w:w="819" w:type="dxa"/>
-            <w:shd w:val="clear" w:color="auto" w:fill="auto"/>
-            <w:vAlign w:val="bottom"/>
-          </w:tcPr>
-          <w:p>
-            <w:pPr>
-              <w:widowControl w:val="0"/>
-              <w:ind w:right="290"/>
-              <w:jc w:val="right"/>
+            <w:tcW w:w="120" w:type="dxa"/>
+            <w:shd w:val="clear" w:color="auto" w:fill="auto"/>
+            <w:vAlign w:val="bottom"/>
+          </w:tcPr>
+          <w:p>
+            <w:pPr>
+              <w:widowControl w:val="0"/>
             </w:pPr>
             <w:r>
               <w:rPr>
@@ -388,7 +382,7 @@
         </w:tc>
         <w:tc>
           <w:tcPr>
-            <w:tcW w:w="6096" w:type="dxa"/>
+            <w:tcW w:w="2580" w:type="dxa"/>
             <w:shd w:val="clear" w:color="auto" w:fill="auto"/>
             <w:vAlign w:val="bottom"/>
           </w:tcPr>
@@ -411,7 +405,7 @@
         </w:trPr>
         <w:tc>
           <w:tcPr>
-            <w:tcW w:w="2355" w:type="dxa"/>
+            <w:tcW w:w="2700" w:type="dxa"/>
             <w:shd w:val="clear" w:color="auto" w:fill="auto"/>
             <w:vAlign w:val="bottom"/>
           </w:tcPr>
@@ -429,15 +423,13 @@
         </w:tc>
         <w:tc>
           <w:tcPr>
-            <w:tcW w:w="819" w:type="dxa"/>
-            <w:shd w:val="clear" w:color="auto" w:fill="auto"/>
-            <w:vAlign w:val="bottom"/>
-          </w:tcPr>
-          <w:p>
-            <w:pPr>
-              <w:widowControl w:val="0"/>
-              <w:ind w:right="290"/>
-              <w:jc w:val="right"/>
+            <w:tcW w:w="120" w:type="dxa"/>
+            <w:shd w:val="clear" w:color="auto" w:fill="auto"/>
+            <w:vAlign w:val="bottom"/>
+          </w:tcPr>
+          <w:p>
+            <w:pPr>
+              <w:widowControl w:val="0"/>
             </w:pPr>
             <w:r>
               <w:rPr>
@@ -449,7 +441,7 @@
         </w:tc>
         <w:tc>
           <w:tcPr>
-            <w:tcW w:w="6096" w:type="dxa"/>
+            <w:tcW w:w="2580" w:type="dxa"/>
             <w:shd w:val="clear" w:color="auto" w:fill="auto"/>
             <w:vAlign w:val="bottom"/>
           </w:tcPr>
@@ -946,8 +938,8 @@
     </w:p>
     <w:tbl>
       <w:tblPr>
-        <w:tblW w:w="8183" w:type="dxa"/>
-        <w:tblInd w:w="1543" w:type="dxa"/>
+        <w:tblW w:w="5400" w:type="dxa"/>
+        <w:jc w:val="center"/>
         <w:tblCellMar>
           <w:left w:w="0" w:type="dxa"/>
           <w:right w:w="0" w:type="dxa"/>
@@ -955,13 +947,13 @@
         <w:tblLook w:val="04A0" w:firstRow="1" w:lastRow="0" w:firstColumn="1" w:lastColumn="0" w:noHBand="0" w:noVBand="1"/>
       </w:tblPr>
       <w:tblGrid>
-        <w:gridCol w:w="2512"/>
-        <w:gridCol w:w="5671"/>
+        <w:gridCol w:w="2700"/>
+        <w:gridCol w:w="2700"/>
       </w:tblGrid>
       <w:tr>
         <w:tc>
           <w:tcPr>
-            <w:tcW w:w="2512" w:type="dxa"/>
+            <w:tcW w:w="2700" w:type="dxa"/>
             <w:shd w:val="clear" w:color="auto" w:fill="auto"/>
             <w:vAlign w:val="bottom"/>
           </w:tcPr>
@@ -980,7 +972,7 @@
         </w:tc>
         <w:tc>
           <w:tcPr>
-            <w:tcW w:w="5671" w:type="dxa"/>
+            <w:tcW w:w="2700" w:type="dxa"/>
             <w:shd w:val="clear" w:color="auto" w:fill="auto"/>
             <w:vAlign w:val="bottom"/>
           </w:tcPr>
@@ -1001,7 +993,7 @@
       <w:tr>
         <w:tc>
           <w:tcPr>
-            <w:tcW w:w="2512" w:type="dxa"/>
+            <w:tcW w:w="2700" w:type="dxa"/>
             <w:shd w:val="clear" w:color="auto" w:fill="auto"/>
             <w:vAlign w:val="bottom"/>
           </w:tcPr>
@@ -1019,7 +1011,7 @@
         </w:tc>
         <w:tc>
           <w:tcPr>
-            <w:tcW w:w="5671" w:type="dxa"/>
+            <w:tcW w:w="2700" w:type="dxa"/>
             <w:shd w:val="clear" w:color="auto" w:fill="auto"/>
             <w:vAlign w:val="bottom"/>
           </w:tcPr>
@@ -1039,7 +1031,7 @@
       <w:tr>
         <w:tc>
           <w:tcPr>
-            <w:tcW w:w="2512" w:type="dxa"/>
+            <w:tcW w:w="2700" w:type="dxa"/>
             <w:shd w:val="clear" w:color="auto" w:fill="auto"/>
             <w:vAlign w:val="bottom"/>
           </w:tcPr>
@@ -1057,7 +1049,7 @@
         </w:tc>
         <w:tc>
           <w:tcPr>
-            <w:tcW w:w="5671" w:type="dxa"/>
+            <w:tcW w:w="2700" w:type="dxa"/>
             <w:shd w:val="clear" w:color="auto" w:fill="auto"/>
             <w:vAlign w:val="bottom"/>
           </w:tcPr>
@@ -1077,7 +1069,7 @@
       <w:tr>
         <w:tc>
           <w:tcPr>
-            <w:tcW w:w="2512" w:type="dxa"/>
+            <w:tcW w:w="2700" w:type="dxa"/>
             <w:shd w:val="clear" w:color="auto" w:fill="auto"/>
             <w:vAlign w:val="bottom"/>
           </w:tcPr>
@@ -1095,7 +1087,7 @@
         </w:tc>
         <w:tc>
           <w:tcPr>
-            <w:tcW w:w="5671" w:type="dxa"/>
+            <w:tcW w:w="2700" w:type="dxa"/>
             <w:shd w:val="clear" w:color="auto" w:fill="auto"/>
             <w:vAlign w:val="bottom"/>
           </w:tcPr>
@@ -1285,9 +1277,8 @@
                 <w:b/>
                 <w:rFonts w:cs="Calibri"/>
                 <w:bCs/>
-                <w:color w:val="0000CC"/>
-              </w:rPr>
-              <w:t xml:space="preserve">&lt;&lt;Name of HOD&gt;&gt;</w:t>
+              </w:rPr>
+              <w:t xml:space="preserve">Dr. Sangeeta Jadhav</w:t>
             </w:r>
           </w:p>
         </w:tc>

</xml_diff>